<commit_message>
Cover letter: state the ChemRxiv preprint explicitly
Co-Authored-By: Claude Sonnet 5.5 <noreply@anthropic.com>
</commit_message>
<xml_diff>
--- a/revision1/FMI_Revision1_Cover_Letter.docx
+++ b/revision1/FMI_Revision1_Cover_Letter.docx
@@ -259,7 +259,7 @@
           <w:i w:val="0"/>
           <w:sz w:val="22"/>
         </w:rPr>
-        <w:t>The new analyses are deposited with the earlier code at https://github.com/sandlerleon/hybrid-liquid-loading-estimation (archived at https://doi.org/10.5281/zenodo.22760863). They include executable checks of the revision code, all of which pass; the original analysis, and Tables 3, 5 and 6 and Figs 2–8, are unchanged. A preprint of the first version is available on ChemRxiv at https://doi.org/10.26434/chemrxiv.15009070/v1.</w:t>
+        <w:t>The new analyses are deposited with the earlier code at https://github.com/sandlerleon/hybrid-liquid-loading-estimation (archived at https://doi.org/10.5281/zenodo.22760863). They include executable checks of the revision code, all of which pass; the original analysis, and Tables 3, 5 and 6 and Figs 2–8, are unchanged.</w:t>
       </w:r>
     </w:p>
     <w:p>
@@ -272,7 +272,20 @@
           <w:i w:val="0"/>
           <w:sz w:val="22"/>
         </w:rPr>
-        <w:t>The manuscript is original, is not under consideration elsewhere, and has not been published previously except as the preprint noted above. I am the sole author, I have no competing interests, and the work received no external funding. The use of a generative AI tool for drafting, literature synthesis, analysis design and code writing is disclosed in the manuscript.</w:t>
+        <w:t>I have also posted the first version of the manuscript as a preprint on ChemRxiv (https://chemrxiv.org/doi/full/10.26434/chemrxiv.15009070/v1; DOI https://doi.org/10.26434/chemrxiv.15009070/v1). The preprint predates the reviews and does not contain the revision.</w:t>
+      </w:r>
+    </w:p>
+    <w:p>
+      <w:pPr>
+        <w:spacing w:after="200"/>
+      </w:pPr>
+      <w:r>
+        <w:rPr>
+          <w:b w:val="0"/>
+          <w:i w:val="0"/>
+          <w:sz w:val="22"/>
+        </w:rPr>
+        <w:t>The manuscript is original, is not under consideration elsewhere, and has not been published previously except as the ChemRxiv preprint noted above. I am the sole author, I have no competing interests, and the work received no external funding. The use of a generative AI tool for drafting, literature synthesis, analysis design and code writing is disclosed in the manuscript.</w:t>
       </w:r>
     </w:p>
     <w:p>

</xml_diff>